<commit_message>
more changes 	modified:   asset data/assets selection.txt 	modified:   black_litterman/black_litterman_portfolio_12months_rolling.py 	modified:   main/Multi-Asset Risk Dashboard & Portfolio.docx
</commit_message>
<xml_diff>
--- a/main/Multi-Asset Risk Dashboard & Portfolio.docx
+++ b/main/Multi-Asset Risk Dashboard & Portfolio.docx
@@ -272,13 +272,7 @@
             <w:rPr>
               <w:rFonts w:ascii="Cambria Math" w:hAnsi="Cambria Math"/>
             </w:rPr>
-            <m:t>Π=</m:t>
-          </m:r>
-          <m:r>
-            <w:rPr>
-              <w:rFonts w:ascii="Cambria Math" w:hAnsi="Cambria Math"/>
-            </w:rPr>
-            <m:t>λΣ</m:t>
+            <m:t>Π=λΣ</m:t>
           </m:r>
           <m:sSub>
             <m:sSubPr>
@@ -407,7 +401,358 @@
         <w:rPr>
           <w:rFonts w:eastAsiaTheme="minorEastAsia"/>
         </w:rPr>
-        <w:t xml:space="preserve">a value depending on the aggressiveness (or risk tolerance) of the portfolio, and instead, calculate it based </w:t>
+        <w:t>a value depending on the aggressiveness (or risk tolerance) of the portfolio, and instead, calculate it b</w:t>
+      </w:r>
+      <w:r>
+        <w:rPr>
+          <w:rFonts w:eastAsiaTheme="minorEastAsia"/>
+        </w:rPr>
+        <w:t>ased off each rolling period, and the risk-free rate of each rolling period’s end date. Data for the risk-free rate was taken from (</w:t>
+      </w:r>
+      <w:hyperlink r:id="rId8" w:history="1">
+        <w:r>
+          <w:rPr>
+            <w:rStyle w:val="Hyperlink"/>
+            <w:rFonts w:eastAsiaTheme="minorEastAsia"/>
+          </w:rPr>
+          <w:t>https://fred.stlouisfed.org/series/DGS3MO</w:t>
+        </w:r>
+      </w:hyperlink>
+      <w:r>
+        <w:rPr>
+          <w:rFonts w:eastAsiaTheme="minorEastAsia"/>
+        </w:rPr>
+        <w:t>)</w:t>
+      </w:r>
+    </w:p>
+    <w:p>
+      <w:pPr>
+        <w:rPr>
+          <w:rFonts w:eastAsiaTheme="minorEastAsia"/>
+        </w:rPr>
+      </w:pPr>
+      <w:r>
+        <w:rPr>
+          <w:rFonts w:eastAsiaTheme="minorEastAsia"/>
+        </w:rPr>
+        <w:t>Based off the assumptions mentioned above, as well as current market trends, I expect</w:t>
+      </w:r>
+      <w:r>
+        <w:rPr>
+          <w:rFonts w:eastAsiaTheme="minorEastAsia"/>
+        </w:rPr>
+        <w:t xml:space="preserve"> the following </w:t>
+      </w:r>
+      <w:r>
+        <w:rPr>
+          <w:rFonts w:eastAsiaTheme="minorEastAsia"/>
+        </w:rPr>
+        <w:t>4</w:t>
+      </w:r>
+      <w:r>
+        <w:rPr>
+          <w:rFonts w:eastAsiaTheme="minorEastAsia"/>
+        </w:rPr>
+        <w:t xml:space="preserve"> views from an investor’s perspective.</w:t>
+      </w:r>
+    </w:p>
+    <w:p>
+      <w:pPr>
+        <w:pStyle w:val="ListParagraph"/>
+        <w:numPr>
+          <w:ilvl w:val="0"/>
+          <w:numId w:val="1"/>
+        </w:numPr>
+        <w:rPr>
+          <w:rFonts w:eastAsiaTheme="minorEastAsia"/>
+        </w:rPr>
+      </w:pPr>
+      <w:r>
+        <w:rPr>
+          <w:rFonts w:eastAsiaTheme="minorEastAsia"/>
+        </w:rPr>
+        <w:t xml:space="preserve">NVIDIA (NVDA) </w:t>
+      </w:r>
+      <w:r>
+        <w:rPr>
+          <w:rFonts w:eastAsiaTheme="minorEastAsia"/>
+        </w:rPr>
+        <w:t xml:space="preserve">will have an expected monthly return of </w:t>
+      </w:r>
+      <w:r>
+        <w:rPr>
+          <w:rFonts w:eastAsiaTheme="minorEastAsia"/>
+        </w:rPr>
+        <w:t>2.5</w:t>
+      </w:r>
+      <w:r>
+        <w:rPr>
+          <w:rFonts w:eastAsiaTheme="minorEastAsia"/>
+        </w:rPr>
+        <w:t>%. This is in part due to their significant growth in market cap, and their heavy investment(s) in AI, which I hold an optimistic view on.</w:t>
+      </w:r>
+    </w:p>
+    <w:p>
+      <w:pPr>
+        <w:pStyle w:val="ListParagraph"/>
+        <w:numPr>
+          <w:ilvl w:val="0"/>
+          <w:numId w:val="1"/>
+        </w:numPr>
+        <w:rPr>
+          <w:rFonts w:eastAsiaTheme="minorEastAsia"/>
+        </w:rPr>
+      </w:pPr>
+      <w:r>
+        <w:rPr>
+          <w:rFonts w:eastAsiaTheme="minorEastAsia"/>
+        </w:rPr>
+        <w:t xml:space="preserve">LOCKHEED MARTIN (LMT) will out-do </w:t>
+      </w:r>
+      <w:r>
+        <w:rPr>
+          <w:rFonts w:eastAsiaTheme="minorEastAsia"/>
+        </w:rPr>
+        <w:t xml:space="preserve">MICROSOFT (MSFT) by </w:t>
+      </w:r>
+      <w:r>
+        <w:rPr>
+          <w:rFonts w:eastAsiaTheme="minorEastAsia"/>
+        </w:rPr>
+        <w:t>1.0</w:t>
+      </w:r>
+      <w:r>
+        <w:rPr>
+          <w:rFonts w:eastAsiaTheme="minorEastAsia"/>
+        </w:rPr>
+        <w:t xml:space="preserve">%. With defense expenditure set to increase in the forthcoming years, I expect </w:t>
+      </w:r>
+      <w:r>
+        <w:rPr>
+          <w:rFonts w:eastAsiaTheme="minorEastAsia"/>
+        </w:rPr>
+        <w:t>Lockheed to win significant contracts. Microsoft, on the other hand,</w:t>
+      </w:r>
+      <w:r>
+        <w:rPr>
+          <w:rFonts w:eastAsiaTheme="minorEastAsia"/>
+        </w:rPr>
+        <w:t xml:space="preserve"> has announced, as of July </w:t>
+      </w:r>
+      <w:r>
+        <w:rPr>
+          <w:rFonts w:eastAsiaTheme="minorEastAsia"/>
+        </w:rPr>
+        <w:t>6</w:t>
+      </w:r>
+      <w:r>
+        <w:rPr>
+          <w:rFonts w:eastAsiaTheme="minorEastAsia"/>
+          <w:vertAlign w:val="superscript"/>
+        </w:rPr>
+        <w:t>th</w:t>
+      </w:r>
+      <w:r>
+        <w:rPr>
+          <w:rFonts w:eastAsiaTheme="minorEastAsia"/>
+        </w:rPr>
+        <w:t>, 2026</w:t>
+      </w:r>
+      <w:r>
+        <w:rPr>
+          <w:rFonts w:eastAsiaTheme="minorEastAsia"/>
+        </w:rPr>
+        <w:t xml:space="preserve">, </w:t>
+      </w:r>
+      <w:r>
+        <w:rPr>
+          <w:rFonts w:eastAsiaTheme="minorEastAsia"/>
+        </w:rPr>
+        <w:t xml:space="preserve">a mass layoff of </w:t>
+      </w:r>
+      <w:r>
+        <w:rPr>
+          <w:rFonts w:eastAsiaTheme="minorEastAsia"/>
+        </w:rPr>
+        <w:t>over 2% of its workforce</w:t>
+      </w:r>
+      <w:r>
+        <w:rPr>
+          <w:rFonts w:eastAsiaTheme="minorEastAsia"/>
+        </w:rPr>
+        <w:t xml:space="preserve"> (primarily in the XBOX department)</w:t>
+      </w:r>
+      <w:r>
+        <w:rPr>
+          <w:rFonts w:eastAsiaTheme="minorEastAsia"/>
+        </w:rPr>
+        <w:t xml:space="preserve"> (</w:t>
+      </w:r>
+      <w:hyperlink r:id="rId9" w:history="1">
+        <w:r>
+          <w:rPr>
+            <w:rStyle w:val="Hyperlink"/>
+            <w:rFonts w:eastAsiaTheme="minorEastAsia"/>
+          </w:rPr>
+          <w:t>https://abcnews.com/Business/microsoft-laying-off-4800-workers-ai-changing-work/story?id=134518435</w:t>
+        </w:r>
+      </w:hyperlink>
+      <w:r>
+        <w:rPr>
+          <w:rFonts w:eastAsiaTheme="minorEastAsia"/>
+        </w:rPr>
+        <w:t xml:space="preserve">). </w:t>
+      </w:r>
+      <w:r>
+        <w:rPr>
+          <w:rFonts w:eastAsiaTheme="minorEastAsia"/>
+        </w:rPr>
+        <w:t xml:space="preserve"> However, I do not expect Microsoft</w:t>
+      </w:r>
+      <w:r>
+        <w:rPr>
+          <w:rFonts w:eastAsiaTheme="minorEastAsia"/>
+        </w:rPr>
+        <w:t xml:space="preserve">’s stock to fall, given how commonplace its Microsoft Office </w:t>
+      </w:r>
+      <w:r>
+        <w:rPr>
+          <w:rFonts w:eastAsiaTheme="minorEastAsia"/>
+        </w:rPr>
+        <w:lastRenderedPageBreak/>
+        <w:t xml:space="preserve">applications are in the workplace, as well as a resurgence of XBOX </w:t>
+      </w:r>
+      <w:r>
+        <w:rPr>
+          <w:rFonts w:eastAsiaTheme="minorEastAsia"/>
+        </w:rPr>
+        <w:t>following the new CEO’s arrival</w:t>
+      </w:r>
+      <w:r>
+        <w:rPr>
+          <w:rFonts w:eastAsiaTheme="minorEastAsia"/>
+        </w:rPr>
+        <w:t>, Asha Sharma.</w:t>
+      </w:r>
+    </w:p>
+    <w:p>
+      <w:pPr>
+        <w:pStyle w:val="ListParagraph"/>
+        <w:numPr>
+          <w:ilvl w:val="0"/>
+          <w:numId w:val="1"/>
+        </w:numPr>
+        <w:rPr>
+          <w:rFonts w:eastAsiaTheme="minorEastAsia"/>
+        </w:rPr>
+      </w:pPr>
+      <w:r>
+        <w:rPr>
+          <w:rFonts w:eastAsiaTheme="minorEastAsia"/>
+        </w:rPr>
+        <w:t xml:space="preserve">TE CONNECTIVITY (TEL) </w:t>
+      </w:r>
+      <w:r>
+        <w:rPr>
+          <w:rFonts w:eastAsiaTheme="minorEastAsia"/>
+        </w:rPr>
+        <w:t xml:space="preserve">will </w:t>
+      </w:r>
+      <w:r>
+        <w:rPr>
+          <w:rFonts w:eastAsiaTheme="minorEastAsia"/>
+        </w:rPr>
+        <w:t>outdo MICRON (MU) by 0.5%</w:t>
+      </w:r>
+      <w:r>
+        <w:rPr>
+          <w:rFonts w:eastAsiaTheme="minorEastAsia"/>
+        </w:rPr>
+        <w:t xml:space="preserve">. TEL </w:t>
+      </w:r>
+      <w:r>
+        <w:rPr>
+          <w:rFonts w:eastAsiaTheme="minorEastAsia"/>
+        </w:rPr>
+        <w:t>will continue to grow, given its importance in the HVAC industry, where its products are commonly used. HVAC</w:t>
+      </w:r>
+      <w:r>
+        <w:rPr>
+          <w:rFonts w:eastAsiaTheme="minorEastAsia"/>
+        </w:rPr>
+        <w:t xml:space="preserve"> will continue to grow, with the increased need for efficiency and </w:t>
+      </w:r>
+      <w:r>
+        <w:rPr>
+          <w:rFonts w:eastAsiaTheme="minorEastAsia"/>
+        </w:rPr>
+        <w:t>electronic components</w:t>
+      </w:r>
+      <w:r>
+        <w:rPr>
+          <w:rFonts w:eastAsiaTheme="minorEastAsia"/>
+        </w:rPr>
+        <w:t>. Moreover, with a rise in AI data centres, it is imperative that HVAC systems boast a high efficiency to save energy, something that TEL can provide.</w:t>
+      </w:r>
+      <w:r>
+        <w:rPr>
+          <w:rFonts w:eastAsiaTheme="minorEastAsia"/>
+        </w:rPr>
+        <w:t xml:space="preserve"> (need to add MU)</w:t>
+      </w:r>
+    </w:p>
+    <w:p>
+      <w:pPr>
+        <w:pStyle w:val="ListParagraph"/>
+        <w:numPr>
+          <w:ilvl w:val="0"/>
+          <w:numId w:val="1"/>
+        </w:numPr>
+        <w:rPr>
+          <w:rFonts w:eastAsiaTheme="minorEastAsia"/>
+        </w:rPr>
+      </w:pPr>
+      <w:r>
+        <w:rPr>
+          <w:rFonts w:eastAsiaTheme="minorEastAsia"/>
+        </w:rPr>
+        <w:t>MARVELL (MRVL)</w:t>
+      </w:r>
+      <w:r>
+        <w:rPr>
+          <w:rFonts w:eastAsiaTheme="minorEastAsia"/>
+        </w:rPr>
+        <w:t xml:space="preserve"> will have an expected monthly return of </w:t>
+      </w:r>
+      <w:r>
+        <w:rPr>
+          <w:rFonts w:eastAsiaTheme="minorEastAsia"/>
+        </w:rPr>
+        <w:t>1</w:t>
+      </w:r>
+      <w:r>
+        <w:rPr>
+          <w:rFonts w:eastAsiaTheme="minorEastAsia"/>
+        </w:rPr>
+        <w:t>.5%</w:t>
+      </w:r>
+      <w:r>
+        <w:rPr>
+          <w:rFonts w:eastAsiaTheme="minorEastAsia"/>
+        </w:rPr>
+        <w:t xml:space="preserve">. </w:t>
+      </w:r>
+      <w:r>
+        <w:rPr>
+          <w:rFonts w:eastAsiaTheme="minorEastAsia"/>
+        </w:rPr>
+        <w:t xml:space="preserve">Jensen Huang (NVIDIA’s CEO) has predicted MARVELL to become a trillion-dollar company in the near future. </w:t>
+      </w:r>
+      <w:r>
+        <w:rPr>
+          <w:rFonts w:eastAsiaTheme="minorEastAsia"/>
+        </w:rPr>
+        <w:t>While the stock rose rapidly due to NVIDIA’s investment, the growth of the semiconductor industry, coupled with the rapid rise of AI, gives MRVL a good chance for its stock price (and market cap) to undergo a steady and significant rise in the future.</w:t>
       </w:r>
     </w:p>
     <w:p>

</xml_diff>

<commit_message>
modified:   main/Multi-Asset Risk Dashboard & Portfolio.docx 	modified:   output/BLO_risk_dashboard.xlsx
</commit_message>
<xml_diff>
--- a/main/Multi-Asset Risk Dashboard & Portfolio.docx
+++ b/main/Multi-Asset Risk Dashboard & Portfolio.docx
@@ -1,6 +1,6 @@
 
 <file path=word/document.xml><?xml version="1.0" encoding="utf-8"?>
-<w:document xmlns:wpc="http://schemas.microsoft.com/office/word/2010/wordprocessingCanvas" xmlns:cx="http://schemas.microsoft.com/office/drawing/2014/chartex" xmlns:cx1="http://schemas.microsoft.com/office/drawing/2015/9/8/chartex" xmlns:cx2="http://schemas.microsoft.com/office/drawing/2015/10/21/chartex" xmlns:cx3="http://schemas.microsoft.com/office/drawing/2016/5/9/chartex" xmlns:cx4="http://schemas.microsoft.com/office/drawing/2016/5/10/chartex" xmlns:cx5="http://schemas.microsoft.com/office/drawing/2016/5/11/chartex" xmlns:cx6="http://schemas.microsoft.com/office/drawing/2016/5/12/chartex" xmlns:cx7="http://schemas.microsoft.com/office/drawing/2016/5/13/chartex" xmlns:cx8="http://schemas.microsoft.com/office/drawing/2016/5/14/chartex" xmlns:mc="http://schemas.openxmlformats.org/markup-compatibility/2006" xmlns:aink="http://schemas.microsoft.com/office/drawing/2016/ink" xmlns:am3d="http://schemas.microsoft.com/office/drawing/2017/model3d" xmlns:o="urn:schemas-microsoft-com:office:office" xmlns:oel="http://schemas.microsoft.com/office/2019/extlst" xmlns:r="http://schemas.openxmlformats.org/officeDocument/2006/relationships" xmlns:m="http://schemas.openxmlformats.org/officeDocument/2006/math" xmlns:v="urn:schemas-microsoft-com:vml" xmlns:wp14="http://schemas.microsoft.com/office/word/2010/wordprocessingDrawing" xmlns:wp="http://schemas.openxmlformats.org/drawingml/2006/wordprocessingDrawing" xmlns:w10="urn:schemas-microsoft-com:office:word" xmlns:w="http://schemas.openxmlformats.org/wordprocessingml/2006/main" xmlns:w14="http://schemas.microsoft.com/office/word/2010/wordml" xmlns:w15="http://schemas.microsoft.com/office/word/2012/wordml" xmlns:w16cex="http://schemas.microsoft.com/office/word/2018/wordml/cex" xmlns:w16cid="http://schemas.microsoft.com/office/word/2016/wordml/cid" xmlns:w16="http://schemas.microsoft.com/office/word/2018/wordml" xmlns:w16du="http://schemas.microsoft.com/office/word/2023/wordml/word16du" xmlns:w16sdtdh="http://schemas.microsoft.com/office/word/2020/wordml/sdtdatahash" xmlns:w16sdtfl="http://schemas.microsoft.com/office/word/2024/wordml/sdtformatlock" xmlns:w16se="http://schemas.microsoft.com/office/word/2015/wordml/symex" xmlns:wpg="http://schemas.microsoft.com/office/word/2010/wordprocessingGroup" xmlns:wpi="http://schemas.microsoft.com/office/word/2010/wordprocessingInk" xmlns:wne="http://schemas.microsoft.com/office/word/2006/wordml" xmlns:wps="http://schemas.microsoft.com/office/word/2010/wordprocessingShape" mc:Ignorable="w14 w15 w16se w16cid w16 w16cex w16sdtdh w16sdtfl w16du wp14">
+<w:document xmlns:wpc="http://schemas.microsoft.com/office/word/2010/wordprocessingCanvas" xmlns:cx="http://schemas.microsoft.com/office/drawing/2014/chartex" xmlns:cx1="http://schemas.microsoft.com/office/drawing/2015/9/8/chartex" xmlns:cx2="http://schemas.microsoft.com/office/drawing/2015/10/21/chartex" xmlns:cx3="http://schemas.microsoft.com/office/drawing/2016/5/9/chartex" xmlns:cx4="http://schemas.microsoft.com/office/drawing/2016/5/10/chartex" xmlns:cx5="http://schemas.microsoft.com/office/drawing/2016/5/11/chartex" xmlns:cx6="http://schemas.microsoft.com/office/drawing/2016/5/12/chartex" xmlns:cx7="http://schemas.microsoft.com/office/drawing/2016/5/13/chartex" xmlns:cx8="http://schemas.microsoft.com/office/drawing/2016/5/14/chartex" xmlns:mc="http://schemas.openxmlformats.org/markup-compatibility/2006" xmlns:aink="http://schemas.microsoft.com/office/drawing/2016/ink" xmlns:am3d="http://schemas.microsoft.com/office/drawing/2017/model3d" xmlns:o="urn:schemas-microsoft-com:office:office" xmlns:oel="http://schemas.microsoft.com/office/2019/extlst" xmlns:r="http://schemas.openxmlformats.org/officeDocument/2006/relationships" xmlns:m="http://schemas.openxmlformats.org/officeDocument/2006/math" xmlns:v="urn:schemas-microsoft-com:vml" xmlns:wp14="http://schemas.microsoft.com/office/word/2010/wordprocessingDrawing" xmlns:wp="http://schemas.openxmlformats.org/drawingml/2006/wordprocessingDrawing" xmlns:w10="urn:schemas-microsoft-com:office:word" xmlns:w="http://schemas.openxmlformats.org/wordprocessingml/2006/main" xmlns:w14="http://schemas.microsoft.com/office/word/2010/wordml" xmlns:w15="http://schemas.microsoft.com/office/word/2012/wordml" xmlns:w16cei="http://schemas.microsoft.com/office/word/2026/wordml/cei" xmlns:w16cex="http://schemas.microsoft.com/office/word/2018/wordml/cex" xmlns:w16cid="http://schemas.microsoft.com/office/word/2016/wordml/cid" xmlns:w16="http://schemas.microsoft.com/office/word/2018/wordml" xmlns:w16du="http://schemas.microsoft.com/office/word/2023/wordml/word16du" xmlns:w16sdtdh="http://schemas.microsoft.com/office/word/2020/wordml/sdtdatahash" xmlns:w16sdtfl="http://schemas.microsoft.com/office/word/2024/wordml/sdtformatlock" xmlns:w16se="http://schemas.microsoft.com/office/word/2015/wordml/symex" xmlns:wpg="http://schemas.microsoft.com/office/word/2010/wordprocessingGroup" xmlns:wpi="http://schemas.microsoft.com/office/word/2010/wordprocessingInk" xmlns:wne="http://schemas.microsoft.com/office/word/2006/wordml" xmlns:wps="http://schemas.microsoft.com/office/word/2010/wordprocessingShape" mc:Ignorable="w14 w15 w16se w16cid w16 w16cex w16sdtdh w16sdtfl w16du wp14">
   <w:body>
     <w:p>
       <w:r>
@@ -9,13 +9,25 @@
     </w:p>
     <w:p>
       <w:r>
+        <w:rPr>
+          <w:highlight w:val="yellow"/>
+        </w:rPr>
         <w:t>I have chosen 24 assets across 6 sectors which I feel will define th</w:t>
       </w:r>
       <w:r>
+        <w:rPr>
+          <w:highlight w:val="yellow"/>
+        </w:rPr>
         <w:t>e (global) economy</w:t>
       </w:r>
       <w:r>
-        <w:t xml:space="preserve"> in the next twenty years. </w:t>
+        <w:rPr>
+          <w:highlight w:val="yellow"/>
+        </w:rPr>
+        <w:t xml:space="preserve"> in the next twenty years</w:t>
+      </w:r>
+      <w:r>
+        <w:t xml:space="preserve">. </w:t>
       </w:r>
       <w:r>
         <w:t xml:space="preserve">With the rise of AI </w:t>
@@ -172,13 +184,10 @@
         <w:t>geopolitical conflicts and potential regional wars could hinder the economy, and therefore, to ensure simplicity, I have assumed the stability</w:t>
       </w:r>
       <w:r>
-        <w:t xml:space="preserve"> of the geopolitical situation (as in, it would be around the same </w:t>
-      </w:r>
-      <w:r>
-        <w:t>(with fluctuations slightly better or worse)</w:t>
-      </w:r>
-      <w:r>
-        <w:t xml:space="preserve"> compared to the current time).</w:t>
+        <w:t xml:space="preserve"> of the geopolitical situation</w:t>
+      </w:r>
+      <w:r>
+        <w:t>, with no “Black Swan” events causing an economic catastrophe.</w:t>
       </w:r>
     </w:p>
     <w:p>
@@ -193,14 +202,14 @@
         <w:t>The tariff situation does not spiral under control. Under Donald Trump, tariffs were imposed on nearly every country, particularly Canada and China, with</w:t>
       </w:r>
       <w:r>
-        <w:t xml:space="preserve"> his reasons surrounding leveraging economic policies, and protecting U.S. </w:t>
+        <w:t xml:space="preserve"> his reasons surrounding leveraging economic policies, and protecting U.S. industry/trade. However, the opposite has happened, with the job market not showing signs of improvement, and wealth inequality worsening. </w:t>
+      </w:r>
+      <w:r>
+        <w:t xml:space="preserve">With Trump’s term to end by </w:t>
       </w:r>
       <w:r>
         <w:lastRenderedPageBreak/>
-        <w:t xml:space="preserve">industry/trade. However, the opposite has happened, with the job market not showing signs of improvement, and wealth inequality worsening. </w:t>
-      </w:r>
-      <w:r>
-        <w:t xml:space="preserve">With Trump’s term to end by January 2029, it remains in the balance as to whether the next president (Democrat or Republican) will reverse or reduce these </w:t>
+        <w:t xml:space="preserve">January 2029, it remains in the balance as to whether the next president (Democrat or Republican) will reverse or reduce these </w:t>
       </w:r>
       <w:r>
         <w:t>tariffs and</w:t>
@@ -223,12 +232,1527 @@
         <w:t>equal weight portfolio ensures equal weightage (4.167%) for each asset.</w:t>
       </w:r>
     </w:p>
+    <w:p>
+      <w:pPr>
+        <w:pStyle w:val="Heading2"/>
+        <w:rPr>
+          <w:rFonts w:ascii="Calibri" w:hAnsi="Calibri" w:cs="Calibri"/>
+        </w:rPr>
+      </w:pPr>
+      <w:r>
+        <w:rPr>
+          <w:rFonts w:ascii="Calibri" w:hAnsi="Calibri" w:cs="Calibri"/>
+        </w:rPr>
+        <w:t>Asset Choice</w:t>
+      </w:r>
+    </w:p>
+    <w:p>
+      <w:r>
+        <w:t>I have opted to invest in the following assets, in the belief that the following will see consistent growth long-term</w:t>
+      </w:r>
+      <w:r>
+        <w:t>.</w:t>
+      </w:r>
+      <w:r>
+        <w:t xml:space="preserve"> For clarity’s sake, I have tabulated my choice by dividing them into sectors I see fit, and explaining said choice in a sentence or two.</w:t>
+      </w:r>
+    </w:p>
+    <w:tbl>
+      <w:tblPr>
+        <w:tblStyle w:val="TableGrid"/>
+        <w:tblW w:w="0" w:type="auto"/>
+        <w:tblLook w:val="04A0" w:firstRow="1" w:lastRow="0" w:firstColumn="1" w:lastColumn="0" w:noHBand="0" w:noVBand="1"/>
+      </w:tblPr>
+      <w:tblGrid>
+        <w:gridCol w:w="3005"/>
+        <w:gridCol w:w="3005"/>
+        <w:gridCol w:w="3006"/>
+      </w:tblGrid>
+      <w:tr>
+        <w:tc>
+          <w:tcPr>
+            <w:tcW w:w="3005" w:type="dxa"/>
+          </w:tcPr>
+          <w:p>
+            <w:r>
+              <w:t>Asset Name</w:t>
+            </w:r>
+          </w:p>
+        </w:tc>
+        <w:tc>
+          <w:tcPr>
+            <w:tcW w:w="3005" w:type="dxa"/>
+          </w:tcPr>
+          <w:p>
+            <w:r>
+              <w:t>Ticker/Stock Symbol</w:t>
+            </w:r>
+          </w:p>
+        </w:tc>
+        <w:tc>
+          <w:tcPr>
+            <w:tcW w:w="3006" w:type="dxa"/>
+          </w:tcPr>
+          <w:p>
+            <w:r>
+              <w:t>Reason for Selection</w:t>
+            </w:r>
+          </w:p>
+        </w:tc>
+      </w:tr>
+      <w:tr>
+        <w:tc>
+          <w:tcPr>
+            <w:tcW w:w="9016" w:type="dxa"/>
+            <w:gridSpan w:val="3"/>
+          </w:tcPr>
+          <w:p>
+            <w:pPr>
+              <w:jc w:val="center"/>
+            </w:pPr>
+            <w:r>
+              <w:t>SEMICONDUCTORS</w:t>
+            </w:r>
+          </w:p>
+        </w:tc>
+      </w:tr>
+      <w:tr>
+        <w:tc>
+          <w:tcPr>
+            <w:tcW w:w="3005" w:type="dxa"/>
+          </w:tcPr>
+          <w:p>
+            <w:pPr>
+              <w:ind w:left="720" w:hanging="720"/>
+            </w:pPr>
+            <w:r>
+              <w:t>NVIDIA Corporation</w:t>
+            </w:r>
+          </w:p>
+        </w:tc>
+        <w:tc>
+          <w:tcPr>
+            <w:tcW w:w="3005" w:type="dxa"/>
+          </w:tcPr>
+          <w:p>
+            <w:r>
+              <w:t>NVDA</w:t>
+            </w:r>
+          </w:p>
+        </w:tc>
+        <w:tc>
+          <w:tcPr>
+            <w:tcW w:w="3006" w:type="dxa"/>
+          </w:tcPr>
+          <w:p/>
+        </w:tc>
+      </w:tr>
+      <w:tr>
+        <w:tc>
+          <w:tcPr>
+            <w:tcW w:w="3005" w:type="dxa"/>
+          </w:tcPr>
+          <w:p>
+            <w:r>
+              <w:t>Broadcom Inc.</w:t>
+            </w:r>
+          </w:p>
+        </w:tc>
+        <w:tc>
+          <w:tcPr>
+            <w:tcW w:w="3005" w:type="dxa"/>
+          </w:tcPr>
+          <w:p>
+            <w:r>
+              <w:t>AVGO</w:t>
+            </w:r>
+          </w:p>
+        </w:tc>
+        <w:tc>
+          <w:tcPr>
+            <w:tcW w:w="3006" w:type="dxa"/>
+          </w:tcPr>
+          <w:p/>
+        </w:tc>
+      </w:tr>
+      <w:tr>
+        <w:tc>
+          <w:tcPr>
+            <w:tcW w:w="3005" w:type="dxa"/>
+          </w:tcPr>
+          <w:p>
+            <w:r>
+              <w:t>Micron Technology, Inc.</w:t>
+            </w:r>
+          </w:p>
+        </w:tc>
+        <w:tc>
+          <w:tcPr>
+            <w:tcW w:w="3005" w:type="dxa"/>
+          </w:tcPr>
+          <w:p>
+            <w:r>
+              <w:t>MU</w:t>
+            </w:r>
+          </w:p>
+        </w:tc>
+        <w:tc>
+          <w:tcPr>
+            <w:tcW w:w="3006" w:type="dxa"/>
+          </w:tcPr>
+          <w:p/>
+        </w:tc>
+      </w:tr>
+      <w:tr>
+        <w:tc>
+          <w:tcPr>
+            <w:tcW w:w="3005" w:type="dxa"/>
+          </w:tcPr>
+          <w:p>
+            <w:r>
+              <w:t>Advanced Micro Devices Inc.</w:t>
+            </w:r>
+          </w:p>
+        </w:tc>
+        <w:tc>
+          <w:tcPr>
+            <w:tcW w:w="3005" w:type="dxa"/>
+          </w:tcPr>
+          <w:p>
+            <w:r>
+              <w:t>AMD</w:t>
+            </w:r>
+          </w:p>
+        </w:tc>
+        <w:tc>
+          <w:tcPr>
+            <w:tcW w:w="3006" w:type="dxa"/>
+          </w:tcPr>
+          <w:p/>
+        </w:tc>
+      </w:tr>
+      <w:tr>
+        <w:tc>
+          <w:tcPr>
+            <w:tcW w:w="3005" w:type="dxa"/>
+          </w:tcPr>
+          <w:p>
+            <w:r>
+              <w:t>Marvell Technology, Inc.</w:t>
+            </w:r>
+          </w:p>
+        </w:tc>
+        <w:tc>
+          <w:tcPr>
+            <w:tcW w:w="3005" w:type="dxa"/>
+          </w:tcPr>
+          <w:p>
+            <w:r>
+              <w:t>MRVL</w:t>
+            </w:r>
+          </w:p>
+        </w:tc>
+        <w:tc>
+          <w:tcPr>
+            <w:tcW w:w="3006" w:type="dxa"/>
+          </w:tcPr>
+          <w:p/>
+        </w:tc>
+      </w:tr>
+      <w:tr>
+        <w:tc>
+          <w:tcPr>
+            <w:tcW w:w="9016" w:type="dxa"/>
+            <w:gridSpan w:val="3"/>
+          </w:tcPr>
+          <w:p>
+            <w:pPr>
+              <w:jc w:val="center"/>
+            </w:pPr>
+            <w:r>
+              <w:t>SOFTWARE</w:t>
+            </w:r>
+          </w:p>
+        </w:tc>
+      </w:tr>
+      <w:tr>
+        <w:tc>
+          <w:tcPr>
+            <w:tcW w:w="3005" w:type="dxa"/>
+          </w:tcPr>
+          <w:p>
+            <w:r>
+              <w:t>Microsoft</w:t>
+            </w:r>
+          </w:p>
+        </w:tc>
+        <w:tc>
+          <w:tcPr>
+            <w:tcW w:w="3005" w:type="dxa"/>
+          </w:tcPr>
+          <w:p>
+            <w:r>
+              <w:t>MSFT</w:t>
+            </w:r>
+          </w:p>
+        </w:tc>
+        <w:tc>
+          <w:tcPr>
+            <w:tcW w:w="3006" w:type="dxa"/>
+          </w:tcPr>
+          <w:p/>
+        </w:tc>
+      </w:tr>
+      <w:tr>
+        <w:tc>
+          <w:tcPr>
+            <w:tcW w:w="3005" w:type="dxa"/>
+          </w:tcPr>
+          <w:p>
+            <w:r>
+              <w:t>CrowdStrike Holdings Inc.</w:t>
+            </w:r>
+          </w:p>
+        </w:tc>
+        <w:tc>
+          <w:tcPr>
+            <w:tcW w:w="3005" w:type="dxa"/>
+          </w:tcPr>
+          <w:p>
+            <w:r>
+              <w:t>CRWD</w:t>
+            </w:r>
+          </w:p>
+        </w:tc>
+        <w:tc>
+          <w:tcPr>
+            <w:tcW w:w="3006" w:type="dxa"/>
+          </w:tcPr>
+          <w:p/>
+        </w:tc>
+      </w:tr>
+      <w:tr>
+        <w:tc>
+          <w:tcPr>
+            <w:tcW w:w="3005" w:type="dxa"/>
+          </w:tcPr>
+          <w:p>
+            <w:pPr>
+              <w:rPr>
+                <w:highlight w:val="yellow"/>
+              </w:rPr>
+            </w:pPr>
+            <w:r>
+              <w:rPr>
+                <w:highlight w:val="yellow"/>
+              </w:rPr>
+              <w:t>Sandisk Corporation</w:t>
+            </w:r>
+          </w:p>
+        </w:tc>
+        <w:tc>
+          <w:tcPr>
+            <w:tcW w:w="3005" w:type="dxa"/>
+          </w:tcPr>
+          <w:p>
+            <w:pPr>
+              <w:rPr>
+                <w:highlight w:val="yellow"/>
+              </w:rPr>
+            </w:pPr>
+            <w:r>
+              <w:rPr>
+                <w:highlight w:val="yellow"/>
+              </w:rPr>
+              <w:t>SNDK</w:t>
+            </w:r>
+          </w:p>
+        </w:tc>
+        <w:tc>
+          <w:tcPr>
+            <w:tcW w:w="3006" w:type="dxa"/>
+          </w:tcPr>
+          <w:p>
+            <w:pPr>
+              <w:rPr>
+                <w:highlight w:val="yellow"/>
+              </w:rPr>
+            </w:pPr>
+          </w:p>
+        </w:tc>
+      </w:tr>
+      <w:tr>
+        <w:tc>
+          <w:tcPr>
+            <w:tcW w:w="3005" w:type="dxa"/>
+          </w:tcPr>
+          <w:p>
+            <w:r>
+              <w:t xml:space="preserve">TE </w:t>
+            </w:r>
+            <w:r>
+              <w:t>Connectivity</w:t>
+            </w:r>
+            <w:r>
+              <w:t xml:space="preserve"> PLC</w:t>
+            </w:r>
+          </w:p>
+        </w:tc>
+        <w:tc>
+          <w:tcPr>
+            <w:tcW w:w="3005" w:type="dxa"/>
+          </w:tcPr>
+          <w:p>
+            <w:r>
+              <w:t>TEL</w:t>
+            </w:r>
+          </w:p>
+        </w:tc>
+        <w:tc>
+          <w:tcPr>
+            <w:tcW w:w="3006" w:type="dxa"/>
+          </w:tcPr>
+          <w:p/>
+        </w:tc>
+      </w:tr>
+      <w:tr>
+        <w:tc>
+          <w:tcPr>
+            <w:tcW w:w="3005" w:type="dxa"/>
+          </w:tcPr>
+          <w:p>
+            <w:r>
+              <w:t>Cadence Design Systems</w:t>
+            </w:r>
+          </w:p>
+        </w:tc>
+        <w:tc>
+          <w:tcPr>
+            <w:tcW w:w="3005" w:type="dxa"/>
+          </w:tcPr>
+          <w:p>
+            <w:r>
+              <w:t>CDNS</w:t>
+            </w:r>
+          </w:p>
+        </w:tc>
+        <w:tc>
+          <w:tcPr>
+            <w:tcW w:w="3006" w:type="dxa"/>
+          </w:tcPr>
+          <w:p/>
+        </w:tc>
+      </w:tr>
+      <w:tr>
+        <w:tc>
+          <w:tcPr>
+            <w:tcW w:w="9016" w:type="dxa"/>
+            <w:gridSpan w:val="3"/>
+          </w:tcPr>
+          <w:p>
+            <w:pPr>
+              <w:jc w:val="center"/>
+            </w:pPr>
+            <w:r>
+              <w:t>AI SOFTWARE</w:t>
+            </w:r>
+          </w:p>
+        </w:tc>
+      </w:tr>
+      <w:tr>
+        <w:tc>
+          <w:tcPr>
+            <w:tcW w:w="3005" w:type="dxa"/>
+          </w:tcPr>
+          <w:p>
+            <w:pPr>
+              <w:rPr>
+                <w:highlight w:val="yellow"/>
+              </w:rPr>
+            </w:pPr>
+            <w:r>
+              <w:rPr>
+                <w:highlight w:val="yellow"/>
+              </w:rPr>
+              <w:t>Snowflake Inc.</w:t>
+            </w:r>
+          </w:p>
+        </w:tc>
+        <w:tc>
+          <w:tcPr>
+            <w:tcW w:w="3005" w:type="dxa"/>
+          </w:tcPr>
+          <w:p>
+            <w:pPr>
+              <w:rPr>
+                <w:highlight w:val="yellow"/>
+              </w:rPr>
+            </w:pPr>
+            <w:r>
+              <w:rPr>
+                <w:highlight w:val="yellow"/>
+              </w:rPr>
+              <w:t>SNOW</w:t>
+            </w:r>
+          </w:p>
+        </w:tc>
+        <w:tc>
+          <w:tcPr>
+            <w:tcW w:w="3006" w:type="dxa"/>
+          </w:tcPr>
+          <w:p>
+            <w:pPr>
+              <w:rPr>
+                <w:highlight w:val="yellow"/>
+              </w:rPr>
+            </w:pPr>
+          </w:p>
+        </w:tc>
+      </w:tr>
+      <w:tr>
+        <w:tc>
+          <w:tcPr>
+            <w:tcW w:w="3005" w:type="dxa"/>
+          </w:tcPr>
+          <w:p>
+            <w:r>
+              <w:t xml:space="preserve">Salesforce Inc. </w:t>
+            </w:r>
+          </w:p>
+        </w:tc>
+        <w:tc>
+          <w:tcPr>
+            <w:tcW w:w="3005" w:type="dxa"/>
+          </w:tcPr>
+          <w:p>
+            <w:r>
+              <w:t>CRM</w:t>
+            </w:r>
+          </w:p>
+        </w:tc>
+        <w:tc>
+          <w:tcPr>
+            <w:tcW w:w="3006" w:type="dxa"/>
+          </w:tcPr>
+          <w:p/>
+        </w:tc>
+      </w:tr>
+      <w:tr>
+        <w:tc>
+          <w:tcPr>
+            <w:tcW w:w="3005" w:type="dxa"/>
+          </w:tcPr>
+          <w:p>
+            <w:r>
+              <w:t>Cloudflare Inc.</w:t>
+            </w:r>
+          </w:p>
+        </w:tc>
+        <w:tc>
+          <w:tcPr>
+            <w:tcW w:w="3005" w:type="dxa"/>
+          </w:tcPr>
+          <w:p>
+            <w:r>
+              <w:t>NET</w:t>
+            </w:r>
+          </w:p>
+        </w:tc>
+        <w:tc>
+          <w:tcPr>
+            <w:tcW w:w="3006" w:type="dxa"/>
+          </w:tcPr>
+          <w:p/>
+        </w:tc>
+      </w:tr>
+      <w:tr>
+        <w:tc>
+          <w:tcPr>
+            <w:tcW w:w="3005" w:type="dxa"/>
+          </w:tcPr>
+          <w:p>
+            <w:r>
+              <w:t>Adobe Inc.</w:t>
+            </w:r>
+          </w:p>
+        </w:tc>
+        <w:tc>
+          <w:tcPr>
+            <w:tcW w:w="3005" w:type="dxa"/>
+          </w:tcPr>
+          <w:p>
+            <w:r>
+              <w:t>ADBE</w:t>
+            </w:r>
+          </w:p>
+        </w:tc>
+        <w:tc>
+          <w:tcPr>
+            <w:tcW w:w="3006" w:type="dxa"/>
+          </w:tcPr>
+          <w:p/>
+        </w:tc>
+      </w:tr>
+      <w:tr>
+        <w:tc>
+          <w:tcPr>
+            <w:tcW w:w="3005" w:type="dxa"/>
+          </w:tcPr>
+          <w:p>
+            <w:r>
+              <w:t>ServiceNow Inc.</w:t>
+            </w:r>
+          </w:p>
+        </w:tc>
+        <w:tc>
+          <w:tcPr>
+            <w:tcW w:w="3005" w:type="dxa"/>
+          </w:tcPr>
+          <w:p>
+            <w:r>
+              <w:t>NOW</w:t>
+            </w:r>
+          </w:p>
+        </w:tc>
+        <w:tc>
+          <w:tcPr>
+            <w:tcW w:w="3006" w:type="dxa"/>
+          </w:tcPr>
+          <w:p/>
+        </w:tc>
+      </w:tr>
+      <w:tr>
+        <w:tc>
+          <w:tcPr>
+            <w:tcW w:w="9016" w:type="dxa"/>
+            <w:gridSpan w:val="3"/>
+          </w:tcPr>
+          <w:p>
+            <w:pPr>
+              <w:jc w:val="center"/>
+            </w:pPr>
+            <w:r>
+              <w:t>DATA CENTERS</w:t>
+            </w:r>
+          </w:p>
+        </w:tc>
+      </w:tr>
+      <w:tr>
+        <w:tc>
+          <w:tcPr>
+            <w:tcW w:w="3005" w:type="dxa"/>
+          </w:tcPr>
+          <w:p>
+            <w:r>
+              <w:t>Equinix Inc.</w:t>
+            </w:r>
+          </w:p>
+        </w:tc>
+        <w:tc>
+          <w:tcPr>
+            <w:tcW w:w="3005" w:type="dxa"/>
+          </w:tcPr>
+          <w:p>
+            <w:r>
+              <w:t>EQIX</w:t>
+            </w:r>
+          </w:p>
+        </w:tc>
+        <w:tc>
+          <w:tcPr>
+            <w:tcW w:w="3006" w:type="dxa"/>
+          </w:tcPr>
+          <w:p/>
+        </w:tc>
+      </w:tr>
+      <w:tr>
+        <w:tc>
+          <w:tcPr>
+            <w:tcW w:w="3005" w:type="dxa"/>
+          </w:tcPr>
+          <w:p>
+            <w:r>
+              <w:t>Digital Realty Trust Inc.</w:t>
+            </w:r>
+          </w:p>
+        </w:tc>
+        <w:tc>
+          <w:tcPr>
+            <w:tcW w:w="3005" w:type="dxa"/>
+          </w:tcPr>
+          <w:p>
+            <w:r>
+              <w:t>DLR</w:t>
+            </w:r>
+          </w:p>
+        </w:tc>
+        <w:tc>
+          <w:tcPr>
+            <w:tcW w:w="3006" w:type="dxa"/>
+          </w:tcPr>
+          <w:p/>
+        </w:tc>
+      </w:tr>
+      <w:tr>
+        <w:tc>
+          <w:tcPr>
+            <w:tcW w:w="3005" w:type="dxa"/>
+          </w:tcPr>
+          <w:p>
+            <w:r>
+              <w:t>Vertiv Holdings Co.</w:t>
+            </w:r>
+          </w:p>
+        </w:tc>
+        <w:tc>
+          <w:tcPr>
+            <w:tcW w:w="3005" w:type="dxa"/>
+          </w:tcPr>
+          <w:p>
+            <w:r>
+              <w:t>VRT</w:t>
+            </w:r>
+          </w:p>
+        </w:tc>
+        <w:tc>
+          <w:tcPr>
+            <w:tcW w:w="3006" w:type="dxa"/>
+          </w:tcPr>
+          <w:p/>
+        </w:tc>
+      </w:tr>
+      <w:tr>
+        <w:tc>
+          <w:tcPr>
+            <w:tcW w:w="3005" w:type="dxa"/>
+          </w:tcPr>
+          <w:p>
+            <w:r>
+              <w:t>Eaton Corporation PLC</w:t>
+            </w:r>
+          </w:p>
+        </w:tc>
+        <w:tc>
+          <w:tcPr>
+            <w:tcW w:w="3005" w:type="dxa"/>
+          </w:tcPr>
+          <w:p>
+            <w:r>
+              <w:t>ETN</w:t>
+            </w:r>
+          </w:p>
+        </w:tc>
+        <w:tc>
+          <w:tcPr>
+            <w:tcW w:w="3006" w:type="dxa"/>
+          </w:tcPr>
+          <w:p/>
+        </w:tc>
+      </w:tr>
+      <w:tr>
+        <w:tc>
+          <w:tcPr>
+            <w:tcW w:w="3005" w:type="dxa"/>
+          </w:tcPr>
+          <w:p>
+            <w:r>
+              <w:t xml:space="preserve">Iron Mountain Inc. </w:t>
+            </w:r>
+          </w:p>
+        </w:tc>
+        <w:tc>
+          <w:tcPr>
+            <w:tcW w:w="3005" w:type="dxa"/>
+          </w:tcPr>
+          <w:p>
+            <w:r>
+              <w:t>IRM</w:t>
+            </w:r>
+          </w:p>
+        </w:tc>
+        <w:tc>
+          <w:tcPr>
+            <w:tcW w:w="3006" w:type="dxa"/>
+          </w:tcPr>
+          <w:p/>
+        </w:tc>
+      </w:tr>
+      <w:tr>
+        <w:tc>
+          <w:tcPr>
+            <w:tcW w:w="9016" w:type="dxa"/>
+            <w:gridSpan w:val="3"/>
+          </w:tcPr>
+          <w:p>
+            <w:pPr>
+              <w:jc w:val="center"/>
+            </w:pPr>
+            <w:r>
+              <w:t>UTILITIES/ENERGY</w:t>
+            </w:r>
+          </w:p>
+        </w:tc>
+      </w:tr>
+      <w:tr>
+        <w:tc>
+          <w:tcPr>
+            <w:tcW w:w="3005" w:type="dxa"/>
+          </w:tcPr>
+          <w:p>
+            <w:r>
+              <w:t>NextEra Energy, Inc.</w:t>
+            </w:r>
+          </w:p>
+        </w:tc>
+        <w:tc>
+          <w:tcPr>
+            <w:tcW w:w="3005" w:type="dxa"/>
+          </w:tcPr>
+          <w:p>
+            <w:r>
+              <w:t>NEE</w:t>
+            </w:r>
+          </w:p>
+        </w:tc>
+        <w:tc>
+          <w:tcPr>
+            <w:tcW w:w="3006" w:type="dxa"/>
+          </w:tcPr>
+          <w:p/>
+        </w:tc>
+      </w:tr>
+      <w:tr>
+        <w:tc>
+          <w:tcPr>
+            <w:tcW w:w="3005" w:type="dxa"/>
+          </w:tcPr>
+          <w:p>
+            <w:pPr>
+              <w:rPr>
+                <w:highlight w:val="yellow"/>
+              </w:rPr>
+            </w:pPr>
+            <w:r>
+              <w:rPr>
+                <w:highlight w:val="yellow"/>
+              </w:rPr>
+              <w:t>Constellation Energy Corp</w:t>
+            </w:r>
+          </w:p>
+        </w:tc>
+        <w:tc>
+          <w:tcPr>
+            <w:tcW w:w="3005" w:type="dxa"/>
+          </w:tcPr>
+          <w:p>
+            <w:pPr>
+              <w:rPr>
+                <w:highlight w:val="yellow"/>
+              </w:rPr>
+            </w:pPr>
+            <w:r>
+              <w:rPr>
+                <w:highlight w:val="yellow"/>
+              </w:rPr>
+              <w:t>CEG</w:t>
+            </w:r>
+          </w:p>
+        </w:tc>
+        <w:tc>
+          <w:tcPr>
+            <w:tcW w:w="3006" w:type="dxa"/>
+          </w:tcPr>
+          <w:p>
+            <w:pPr>
+              <w:rPr>
+                <w:highlight w:val="yellow"/>
+              </w:rPr>
+            </w:pPr>
+          </w:p>
+        </w:tc>
+      </w:tr>
+      <w:tr>
+        <w:tc>
+          <w:tcPr>
+            <w:tcW w:w="3005" w:type="dxa"/>
+          </w:tcPr>
+          <w:p>
+            <w:r>
+              <w:t>Southern Co.</w:t>
+            </w:r>
+          </w:p>
+        </w:tc>
+        <w:tc>
+          <w:tcPr>
+            <w:tcW w:w="3005" w:type="dxa"/>
+          </w:tcPr>
+          <w:p>
+            <w:r>
+              <w:t>SO</w:t>
+            </w:r>
+          </w:p>
+        </w:tc>
+        <w:tc>
+          <w:tcPr>
+            <w:tcW w:w="3006" w:type="dxa"/>
+          </w:tcPr>
+          <w:p/>
+        </w:tc>
+      </w:tr>
+      <w:tr>
+        <w:tc>
+          <w:tcPr>
+            <w:tcW w:w="3005" w:type="dxa"/>
+          </w:tcPr>
+          <w:p>
+            <w:r>
+              <w:t>Sempra</w:t>
+            </w:r>
+          </w:p>
+        </w:tc>
+        <w:tc>
+          <w:tcPr>
+            <w:tcW w:w="3005" w:type="dxa"/>
+          </w:tcPr>
+          <w:p>
+            <w:r>
+              <w:t>SRE</w:t>
+            </w:r>
+          </w:p>
+        </w:tc>
+        <w:tc>
+          <w:tcPr>
+            <w:tcW w:w="3006" w:type="dxa"/>
+          </w:tcPr>
+          <w:p/>
+        </w:tc>
+      </w:tr>
+      <w:tr>
+        <w:tc>
+          <w:tcPr>
+            <w:tcW w:w="9016" w:type="dxa"/>
+            <w:gridSpan w:val="3"/>
+          </w:tcPr>
+          <w:p>
+            <w:pPr>
+              <w:jc w:val="center"/>
+            </w:pPr>
+            <w:r>
+              <w:t>DEFENSE &amp; AEROSPACE</w:t>
+            </w:r>
+          </w:p>
+        </w:tc>
+      </w:tr>
+      <w:tr>
+        <w:tc>
+          <w:tcPr>
+            <w:tcW w:w="3005" w:type="dxa"/>
+          </w:tcPr>
+          <w:p>
+            <w:r>
+              <w:t>Lockheed Martin Corp.</w:t>
+            </w:r>
+          </w:p>
+        </w:tc>
+        <w:tc>
+          <w:tcPr>
+            <w:tcW w:w="3005" w:type="dxa"/>
+          </w:tcPr>
+          <w:p>
+            <w:r>
+              <w:t>LMT</w:t>
+            </w:r>
+          </w:p>
+        </w:tc>
+        <w:tc>
+          <w:tcPr>
+            <w:tcW w:w="3006" w:type="dxa"/>
+          </w:tcPr>
+          <w:p/>
+        </w:tc>
+      </w:tr>
+      <w:tr>
+        <w:tc>
+          <w:tcPr>
+            <w:tcW w:w="3005" w:type="dxa"/>
+          </w:tcPr>
+          <w:p>
+            <w:r>
+              <w:t>RTX Corp Inc.</w:t>
+            </w:r>
+          </w:p>
+        </w:tc>
+        <w:tc>
+          <w:tcPr>
+            <w:tcW w:w="3005" w:type="dxa"/>
+          </w:tcPr>
+          <w:p>
+            <w:r>
+              <w:t>RTX</w:t>
+            </w:r>
+          </w:p>
+        </w:tc>
+        <w:tc>
+          <w:tcPr>
+            <w:tcW w:w="3006" w:type="dxa"/>
+          </w:tcPr>
+          <w:p/>
+        </w:tc>
+      </w:tr>
+      <w:tr>
+        <w:tc>
+          <w:tcPr>
+            <w:tcW w:w="3005" w:type="dxa"/>
+          </w:tcPr>
+          <w:p>
+            <w:r>
+              <w:lastRenderedPageBreak/>
+              <w:t>General Dynamics Corp.</w:t>
+            </w:r>
+          </w:p>
+        </w:tc>
+        <w:tc>
+          <w:tcPr>
+            <w:tcW w:w="3005" w:type="dxa"/>
+          </w:tcPr>
+          <w:p>
+            <w:r>
+              <w:t>GD</w:t>
+            </w:r>
+          </w:p>
+        </w:tc>
+        <w:tc>
+          <w:tcPr>
+            <w:tcW w:w="3006" w:type="dxa"/>
+          </w:tcPr>
+          <w:p/>
+        </w:tc>
+      </w:tr>
+    </w:tbl>
     <w:p/>
+    <w:p>
+      <w:r>
+        <w:t>This list contains 27 assets scattered across 6 sectors. However, upon exporting the relevant end-of-day prices to Excel, three assets (</w:t>
+      </w:r>
+      <w:r>
+        <w:t>SNDK, SNOW, and CEG) did not have sufficient data, and hence</w:t>
+      </w:r>
+      <w:r>
+        <w:t>, were omitted from the portfolio optimization</w:t>
+      </w:r>
+      <w:r>
+        <w:t xml:space="preserve">, meaning </w:t>
+      </w:r>
+      <w:r>
+        <w:t>the portfolio revolved around 24 assets.</w:t>
+      </w:r>
+    </w:p>
     <w:p>
       <w:pPr>
         <w:pStyle w:val="Heading2"/>
       </w:pPr>
       <w:r>
+        <w:t>Selection of Data</w:t>
+      </w:r>
+    </w:p>
+    <w:p>
+      <w:r>
+        <w:t xml:space="preserve">End-of-day prices for the 24 assets were exported to Excel from Yahoo Finance (using the yfinance module on Python). </w:t>
+      </w:r>
+      <w:r>
+        <w:t>The end-of-day returns were calculated from these exported prices using the following equation:</w:t>
+      </w:r>
+    </w:p>
+    <w:p>
+      <w:pPr>
+        <w:rPr>
+          <w:rFonts w:eastAsiaTheme="minorEastAsia"/>
+        </w:rPr>
+      </w:pPr>
+      <m:oMathPara>
+        <m:oMath>
+          <m:r>
+            <w:rPr>
+              <w:rFonts w:ascii="Cambria Math" w:hAnsi="Cambria Math"/>
+            </w:rPr>
+            <m:t xml:space="preserve">Return </m:t>
+          </m:r>
+          <m:d>
+            <m:dPr>
+              <m:ctrlPr>
+                <w:rPr>
+                  <w:rFonts w:ascii="Cambria Math" w:hAnsi="Cambria Math"/>
+                  <w:i/>
+                </w:rPr>
+              </m:ctrlPr>
+            </m:dPr>
+            <m:e>
+              <m:r>
+                <w:rPr>
+                  <w:rFonts w:ascii="Cambria Math" w:hAnsi="Cambria Math"/>
+                </w:rPr>
+                <m:t>%</m:t>
+              </m:r>
+            </m:e>
+          </m:d>
+          <m:r>
+            <w:rPr>
+              <w:rFonts w:ascii="Cambria Math" w:hAnsi="Cambria Math"/>
+            </w:rPr>
+            <m:t>=</m:t>
+          </m:r>
+          <m:d>
+            <m:dPr>
+              <m:ctrlPr>
+                <w:rPr>
+                  <w:rFonts w:ascii="Cambria Math" w:hAnsi="Cambria Math"/>
+                  <w:i/>
+                </w:rPr>
+              </m:ctrlPr>
+            </m:dPr>
+            <m:e>
+              <m:d>
+                <m:dPr>
+                  <m:ctrlPr>
+                    <w:rPr>
+                      <w:rFonts w:ascii="Cambria Math" w:hAnsi="Cambria Math"/>
+                      <w:i/>
+                    </w:rPr>
+                  </m:ctrlPr>
+                </m:dPr>
+                <m:e>
+                  <m:f>
+                    <m:fPr>
+                      <m:ctrlPr>
+                        <w:rPr>
+                          <w:rFonts w:ascii="Cambria Math" w:hAnsi="Cambria Math"/>
+                          <w:i/>
+                        </w:rPr>
+                      </m:ctrlPr>
+                    </m:fPr>
+                    <m:num>
+                      <m:sSub>
+                        <m:sSubPr>
+                          <m:ctrlPr>
+                            <w:rPr>
+                              <w:rFonts w:ascii="Cambria Math" w:hAnsi="Cambria Math"/>
+                              <w:i/>
+                            </w:rPr>
+                          </m:ctrlPr>
+                        </m:sSubPr>
+                        <m:e>
+                          <m:r>
+                            <w:rPr>
+                              <w:rFonts w:ascii="Cambria Math" w:hAnsi="Cambria Math"/>
+                            </w:rPr>
+                            <m:t>P</m:t>
+                          </m:r>
+                        </m:e>
+                        <m:sub>
+                          <m:r>
+                            <w:rPr>
+                              <w:rFonts w:ascii="Cambria Math" w:hAnsi="Cambria Math"/>
+                            </w:rPr>
+                            <m:t>t</m:t>
+                          </m:r>
+                          <m:r>
+                            <w:rPr>
+                              <w:rFonts w:ascii="Cambria Math" w:hAnsi="Cambria Math"/>
+                            </w:rPr>
+                            <m:t>+1</m:t>
+                          </m:r>
+                        </m:sub>
+                      </m:sSub>
+                    </m:num>
+                    <m:den>
+                      <m:sSub>
+                        <m:sSubPr>
+                          <m:ctrlPr>
+                            <w:rPr>
+                              <w:rFonts w:ascii="Cambria Math" w:hAnsi="Cambria Math"/>
+                              <w:i/>
+                            </w:rPr>
+                          </m:ctrlPr>
+                        </m:sSubPr>
+                        <m:e>
+                          <m:r>
+                            <w:rPr>
+                              <w:rFonts w:ascii="Cambria Math" w:hAnsi="Cambria Math"/>
+                            </w:rPr>
+                            <m:t>P</m:t>
+                          </m:r>
+                        </m:e>
+                        <m:sub>
+                          <m:r>
+                            <w:rPr>
+                              <w:rFonts w:ascii="Cambria Math" w:hAnsi="Cambria Math"/>
+                            </w:rPr>
+                            <m:t>t</m:t>
+                          </m:r>
+                        </m:sub>
+                      </m:sSub>
+                    </m:den>
+                  </m:f>
+                </m:e>
+              </m:d>
+              <m:r>
+                <w:rPr>
+                  <w:rFonts w:ascii="Cambria Math" w:hAnsi="Cambria Math"/>
+                </w:rPr>
+                <m:t>-1</m:t>
+              </m:r>
+            </m:e>
+          </m:d>
+          <m:r>
+            <w:rPr>
+              <w:rFonts w:ascii="Cambria Math" w:hAnsi="Cambria Math"/>
+            </w:rPr>
+            <m:t>*100</m:t>
+          </m:r>
+        </m:oMath>
+      </m:oMathPara>
+    </w:p>
+    <w:p>
+      <w:pPr>
+        <w:rPr>
+          <w:rFonts w:eastAsiaTheme="minorEastAsia"/>
+        </w:rPr>
+      </w:pPr>
+      <w:r>
+        <w:rPr>
+          <w:rFonts w:eastAsiaTheme="minorEastAsia"/>
+        </w:rPr>
+        <w:t xml:space="preserve">Where </w:t>
+      </w:r>
+      <m:oMath>
+        <m:sSub>
+          <m:sSubPr>
+            <m:ctrlPr>
+              <w:rPr>
+                <w:rFonts w:ascii="Cambria Math" w:eastAsiaTheme="minorEastAsia" w:hAnsi="Cambria Math"/>
+                <w:i/>
+              </w:rPr>
+            </m:ctrlPr>
+          </m:sSubPr>
+          <m:e>
+            <m:r>
+              <w:rPr>
+                <w:rFonts w:ascii="Cambria Math" w:eastAsiaTheme="minorEastAsia" w:hAnsi="Cambria Math"/>
+              </w:rPr>
+              <m:t>P</m:t>
+            </m:r>
+          </m:e>
+          <m:sub>
+            <m:r>
+              <w:rPr>
+                <w:rFonts w:ascii="Cambria Math" w:eastAsiaTheme="minorEastAsia" w:hAnsi="Cambria Math"/>
+              </w:rPr>
+              <m:t>t</m:t>
+            </m:r>
+            <m:r>
+              <w:rPr>
+                <w:rFonts w:ascii="Cambria Math" w:eastAsiaTheme="minorEastAsia" w:hAnsi="Cambria Math"/>
+              </w:rPr>
+              <m:t>+1</m:t>
+            </m:r>
+          </m:sub>
+        </m:sSub>
+      </m:oMath>
+      <w:r>
+        <w:rPr>
+          <w:rFonts w:eastAsiaTheme="minorEastAsia"/>
+        </w:rPr>
+        <w:t xml:space="preserve"> is </w:t>
+      </w:r>
+      <w:r>
+        <w:rPr>
+          <w:rFonts w:eastAsiaTheme="minorEastAsia"/>
+        </w:rPr>
+        <w:t xml:space="preserve">the price of the stock at time </w:t>
+      </w:r>
+      <m:oMath>
+        <m:r>
+          <w:rPr>
+            <w:rFonts w:ascii="Cambria Math" w:eastAsiaTheme="minorEastAsia" w:hAnsi="Cambria Math"/>
+          </w:rPr>
+          <m:t>t+1</m:t>
+        </m:r>
+      </m:oMath>
+      <w:r>
+        <w:rPr>
+          <w:rFonts w:eastAsiaTheme="minorEastAsia"/>
+        </w:rPr>
+        <w:t xml:space="preserve">, and </w:t>
+      </w:r>
+      <m:oMath>
+        <m:sSub>
+          <m:sSubPr>
+            <m:ctrlPr>
+              <w:rPr>
+                <w:rFonts w:ascii="Cambria Math" w:eastAsiaTheme="minorEastAsia" w:hAnsi="Cambria Math"/>
+                <w:i/>
+              </w:rPr>
+            </m:ctrlPr>
+          </m:sSubPr>
+          <m:e>
+            <m:r>
+              <w:rPr>
+                <w:rFonts w:ascii="Cambria Math" w:eastAsiaTheme="minorEastAsia" w:hAnsi="Cambria Math"/>
+              </w:rPr>
+              <m:t>P</m:t>
+            </m:r>
+          </m:e>
+          <m:sub>
+            <m:r>
+              <w:rPr>
+                <w:rFonts w:ascii="Cambria Math" w:eastAsiaTheme="minorEastAsia" w:hAnsi="Cambria Math"/>
+              </w:rPr>
+              <m:t>t</m:t>
+            </m:r>
+          </m:sub>
+        </m:sSub>
+      </m:oMath>
+      <w:r>
+        <w:rPr>
+          <w:rFonts w:eastAsiaTheme="minorEastAsia"/>
+        </w:rPr>
+        <w:t xml:space="preserve"> is the price of the stock at time </w:t>
+      </w:r>
+      <m:oMath>
+        <m:r>
+          <w:rPr>
+            <w:rFonts w:ascii="Cambria Math" w:eastAsiaTheme="minorEastAsia" w:hAnsi="Cambria Math"/>
+          </w:rPr>
+          <m:t>t</m:t>
+        </m:r>
+      </m:oMath>
+      <w:r>
+        <w:rPr>
+          <w:rFonts w:eastAsiaTheme="minorEastAsia"/>
+        </w:rPr>
+        <w:t xml:space="preserve">, and </w:t>
+      </w:r>
+      <m:oMath>
+        <m:r>
+          <w:rPr>
+            <w:rFonts w:ascii="Cambria Math" w:eastAsiaTheme="minorEastAsia" w:hAnsi="Cambria Math"/>
+          </w:rPr>
+          <m:t>t∈N</m:t>
+        </m:r>
+      </m:oMath>
+      <w:r>
+        <w:rPr>
+          <w:rFonts w:eastAsiaTheme="minorEastAsia"/>
+        </w:rPr>
+        <w:t>.</w:t>
+      </w:r>
+    </w:p>
+    <w:p>
+      <w:pPr>
+        <w:rPr>
+          <w:rFonts w:eastAsiaTheme="minorEastAsia"/>
+        </w:rPr>
+      </w:pPr>
+      <w:r>
+        <w:rPr>
+          <w:rFonts w:eastAsiaTheme="minorEastAsia"/>
+        </w:rPr>
+        <w:t xml:space="preserve">Data was taken from January </w:t>
+      </w:r>
+      <w:r>
+        <w:rPr>
+          <w:rFonts w:eastAsiaTheme="minorEastAsia"/>
+        </w:rPr>
+        <w:t>2020</w:t>
+      </w:r>
+      <w:r>
+        <w:rPr>
+          <w:rFonts w:eastAsiaTheme="minorEastAsia"/>
+        </w:rPr>
+        <w:t xml:space="preserve"> to May 20</w:t>
+      </w:r>
+      <w:r>
+        <w:rPr>
+          <w:rFonts w:eastAsiaTheme="minorEastAsia"/>
+        </w:rPr>
+        <w:t xml:space="preserve">26, for a total of </w:t>
+      </w:r>
+      <w:r>
+        <w:rPr>
+          <w:rFonts w:eastAsiaTheme="minorEastAsia"/>
+        </w:rPr>
+        <w:t xml:space="preserve">77 months. To ensure </w:t>
+      </w:r>
+      <w:r>
+        <w:rPr>
+          <w:rFonts w:eastAsiaTheme="minorEastAsia"/>
+        </w:rPr>
+        <w:t>the minimization of market noise (due to short-term swings</w:t>
+      </w:r>
+      <w:r>
+        <w:rPr>
+          <w:rFonts w:eastAsiaTheme="minorEastAsia"/>
+        </w:rPr>
+        <w:t xml:space="preserve"> in the market), and reduced sensitivity of </w:t>
+      </w:r>
+      <w:r>
+        <w:rPr>
+          <w:rFonts w:eastAsiaTheme="minorEastAsia"/>
+        </w:rPr>
+        <w:t xml:space="preserve">Sharpe and Sortino ratios due to minor changes in the end-of-day price, </w:t>
+      </w:r>
+      <w:r>
+        <w:rPr>
+          <w:rFonts w:eastAsiaTheme="minorEastAsia"/>
+        </w:rPr>
+        <w:t>a 12-month rolling period was</w:t>
+      </w:r>
+      <w:r>
+        <w:rPr>
+          <w:rFonts w:eastAsiaTheme="minorEastAsia"/>
+        </w:rPr>
+        <w:t xml:space="preserve"> considered, allowing for 65 rolling periods.</w:t>
+      </w:r>
+      <w:r>
+        <w:rPr>
+          <w:rFonts w:eastAsiaTheme="minorEastAsia"/>
+        </w:rPr>
+        <w:t xml:space="preserve"> </w:t>
+      </w:r>
+    </w:p>
+    <w:p>
+      <w:pPr>
+        <w:rPr>
+          <w:rFonts w:eastAsiaTheme="minorEastAsia"/>
+        </w:rPr>
+      </w:pPr>
+      <w:r>
+        <w:rPr>
+          <w:rFonts w:eastAsiaTheme="minorEastAsia"/>
+        </w:rPr>
+        <w:t xml:space="preserve">Look-ahead bias was avoided by ensuring that all data in a rolling period is dated before the </w:t>
+      </w:r>
+      <w:r>
+        <w:rPr>
+          <w:rFonts w:eastAsiaTheme="minorEastAsia"/>
+        </w:rPr>
+        <w:t>period’s timestamp. For example, metrics dated Jan</w:t>
+      </w:r>
+      <w:r>
+        <w:rPr>
+          <w:rFonts w:eastAsiaTheme="minorEastAsia"/>
+        </w:rPr>
+        <w:t xml:space="preserve">uary 4, 2021 (the first trading day of 2021) would be calculated from data between </w:t>
+      </w:r>
+      <w:r>
+        <w:rPr>
+          <w:rFonts w:eastAsiaTheme="minorEastAsia"/>
+        </w:rPr>
+        <w:t xml:space="preserve">January 2, </w:t>
+      </w:r>
+      <w:r>
+        <w:rPr>
+          <w:rFonts w:eastAsiaTheme="minorEastAsia"/>
+        </w:rPr>
+        <w:t>2020,</w:t>
+      </w:r>
+      <w:r>
+        <w:rPr>
+          <w:rFonts w:eastAsiaTheme="minorEastAsia"/>
+        </w:rPr>
+        <w:t xml:space="preserve"> and December 31, 2020. </w:t>
+      </w:r>
+      <w:r>
+        <w:rPr>
+          <w:rFonts w:eastAsiaTheme="minorEastAsia"/>
+        </w:rPr>
+        <w:t>Monthly metrics were calculated based off end-of-day returns.</w:t>
+      </w:r>
+      <w:r>
+        <w:rPr>
+          <w:rFonts w:eastAsiaTheme="minorEastAsia"/>
+        </w:rPr>
+        <w:t xml:space="preserve"> </w:t>
+      </w:r>
+    </w:p>
+    <w:p>
+      <w:pPr>
+        <w:pStyle w:val="Heading2"/>
+        <w:rPr>
+          <w:rFonts w:eastAsiaTheme="minorEastAsia"/>
+        </w:rPr>
+      </w:pPr>
+      <w:r>
+        <w:rPr>
+          <w:rFonts w:eastAsiaTheme="minorEastAsia"/>
+        </w:rPr>
+        <w:t>Metric Assumptions</w:t>
+      </w:r>
+    </w:p>
+    <w:p>
+      <w:r>
+        <w:t>The following assumptions were put in place for the portfolios:</w:t>
+      </w:r>
+    </w:p>
+    <w:p>
+      <w:pPr>
+        <w:pStyle w:val="ListParagraph"/>
+        <w:numPr>
+          <w:ilvl w:val="0"/>
+          <w:numId w:val="1"/>
+        </w:numPr>
+      </w:pPr>
+      <w:r>
+        <w:t>$1,000 initial wealth</w:t>
+      </w:r>
+    </w:p>
+    <w:p>
+      <w:pPr>
+        <w:pStyle w:val="ListParagraph"/>
+        <w:numPr>
+          <w:ilvl w:val="0"/>
+          <w:numId w:val="1"/>
+        </w:numPr>
+      </w:pPr>
+      <w:r>
+        <w:t>0.15% trade value as the transaction cost</w:t>
+      </w:r>
+    </w:p>
+    <w:p>
+      <w:pPr>
+        <w:pStyle w:val="ListParagraph"/>
+        <w:numPr>
+          <w:ilvl w:val="0"/>
+          <w:numId w:val="1"/>
+        </w:numPr>
+      </w:pPr>
+      <w:r>
+        <w:t>No shorting (portfolio weights between zero and 1)</w:t>
+      </w:r>
+    </w:p>
+    <w:p>
+      <w:pPr>
+        <w:pStyle w:val="ListParagraph"/>
+        <w:numPr>
+          <w:ilvl w:val="0"/>
+          <w:numId w:val="1"/>
+        </w:numPr>
+      </w:pPr>
+      <w:r>
+        <w:t>12-month rolling periods</w:t>
+      </w:r>
+    </w:p>
+    <w:p>
+      <w:pPr>
+        <w:pStyle w:val="Heading2"/>
+        <w:rPr>
+          <w:rFonts w:ascii="Calibri" w:hAnsi="Calibri" w:cs="Calibri"/>
+        </w:rPr>
+      </w:pPr>
+      <w:r>
+        <w:rPr>
+          <w:rFonts w:ascii="Calibri" w:hAnsi="Calibri" w:cs="Calibri"/>
+        </w:rPr>
         <w:t>Black-Litterman Model</w:t>
       </w:r>
     </w:p>
@@ -313,6 +1837,7 @@
         <w:rPr>
           <w:rFonts w:eastAsiaTheme="minorEastAsia"/>
         </w:rPr>
+        <w:lastRenderedPageBreak/>
         <w:t xml:space="preserve">Where </w:t>
       </w:r>
       <w:r>
@@ -613,14 +2138,7 @@
         <w:rPr>
           <w:rFonts w:eastAsiaTheme="minorEastAsia"/>
         </w:rPr>
-        <w:t xml:space="preserve">’s stock to fall, given how commonplace its Microsoft Office </w:t>
-      </w:r>
-      <w:r>
-        <w:rPr>
-          <w:rFonts w:eastAsiaTheme="minorEastAsia"/>
-        </w:rPr>
-        <w:lastRenderedPageBreak/>
-        <w:t xml:space="preserve">applications are in the workplace, as well as a resurgence of XBOX </w:t>
+        <w:t xml:space="preserve">’s stock to fall, given how commonplace its Microsoft Office applications are in the workplace, as well as a resurgence of XBOX </w:t>
       </w:r>
       <w:r>
         <w:rPr>
@@ -754,6 +2272,20 @@
         </w:rPr>
         <w:t>While the stock rose rapidly due to NVIDIA’s investment, the growth of the semiconductor industry, coupled with the rapid rise of AI, gives MRVL a good chance for its stock price (and market cap) to undergo a steady and significant rise in the future.</w:t>
       </w:r>
+    </w:p>
+    <w:p>
+      <w:pPr>
+        <w:rPr>
+          <w:rFonts w:eastAsiaTheme="minorEastAsia"/>
+        </w:rPr>
+      </w:pPr>
+    </w:p>
+    <w:p>
+      <w:pPr>
+        <w:rPr>
+          <w:rFonts w:eastAsiaTheme="minorEastAsia"/>
+        </w:rPr>
+      </w:pPr>
     </w:p>
     <w:p>
       <w:pPr>
@@ -779,7 +2311,7 @@
 </file>
 
 <file path=word/numbering.xml><?xml version="1.0" encoding="utf-8"?>
-<w:numbering xmlns:wpc="http://schemas.microsoft.com/office/word/2010/wordprocessingCanvas" xmlns:cx="http://schemas.microsoft.com/office/drawing/2014/chartex" xmlns:cx1="http://schemas.microsoft.com/office/drawing/2015/9/8/chartex" xmlns:cx2="http://schemas.microsoft.com/office/drawing/2015/10/21/chartex" xmlns:cx3="http://schemas.microsoft.com/office/drawing/2016/5/9/chartex" xmlns:cx4="http://schemas.microsoft.com/office/drawing/2016/5/10/chartex" xmlns:cx5="http://schemas.microsoft.com/office/drawing/2016/5/11/chartex" xmlns:cx6="http://schemas.microsoft.com/office/drawing/2016/5/12/chartex" xmlns:cx7="http://schemas.microsoft.com/office/drawing/2016/5/13/chartex" xmlns:cx8="http://schemas.microsoft.com/office/drawing/2016/5/14/chartex" xmlns:mc="http://schemas.openxmlformats.org/markup-compatibility/2006" xmlns:aink="http://schemas.microsoft.com/office/drawing/2016/ink" xmlns:am3d="http://schemas.microsoft.com/office/drawing/2017/model3d" xmlns:o="urn:schemas-microsoft-com:office:office" xmlns:oel="http://schemas.microsoft.com/office/2019/extlst" xmlns:r="http://schemas.openxmlformats.org/officeDocument/2006/relationships" xmlns:m="http://schemas.openxmlformats.org/officeDocument/2006/math" xmlns:v="urn:schemas-microsoft-com:vml" xmlns:wp14="http://schemas.microsoft.com/office/word/2010/wordprocessingDrawing" xmlns:wp="http://schemas.openxmlformats.org/drawingml/2006/wordprocessingDrawing" xmlns:w10="urn:schemas-microsoft-com:office:word" xmlns:w="http://schemas.openxmlformats.org/wordprocessingml/2006/main" xmlns:w14="http://schemas.microsoft.com/office/word/2010/wordml" xmlns:w15="http://schemas.microsoft.com/office/word/2012/wordml" xmlns:w16cex="http://schemas.microsoft.com/office/word/2018/wordml/cex" xmlns:w16cid="http://schemas.microsoft.com/office/word/2016/wordml/cid" xmlns:w16="http://schemas.microsoft.com/office/word/2018/wordml" xmlns:w16du="http://schemas.microsoft.com/office/word/2023/wordml/word16du" xmlns:w16sdtdh="http://schemas.microsoft.com/office/word/2020/wordml/sdtdatahash" xmlns:w16sdtfl="http://schemas.microsoft.com/office/word/2024/wordml/sdtformatlock" xmlns:w16se="http://schemas.microsoft.com/office/word/2015/wordml/symex" xmlns:wpg="http://schemas.microsoft.com/office/word/2010/wordprocessingGroup" xmlns:wpi="http://schemas.microsoft.com/office/word/2010/wordprocessingInk" xmlns:wne="http://schemas.microsoft.com/office/word/2006/wordml" xmlns:wps="http://schemas.microsoft.com/office/word/2010/wordprocessingShape" mc:Ignorable="w14 w15 w16se w16cid w16 w16cex w16sdtdh w16sdtfl w16du wp14">
+<w:numbering xmlns:wpc="http://schemas.microsoft.com/office/word/2010/wordprocessingCanvas" xmlns:cx="http://schemas.microsoft.com/office/drawing/2014/chartex" xmlns:cx1="http://schemas.microsoft.com/office/drawing/2015/9/8/chartex" xmlns:cx2="http://schemas.microsoft.com/office/drawing/2015/10/21/chartex" xmlns:cx3="http://schemas.microsoft.com/office/drawing/2016/5/9/chartex" xmlns:cx4="http://schemas.microsoft.com/office/drawing/2016/5/10/chartex" xmlns:cx5="http://schemas.microsoft.com/office/drawing/2016/5/11/chartex" xmlns:cx6="http://schemas.microsoft.com/office/drawing/2016/5/12/chartex" xmlns:cx7="http://schemas.microsoft.com/office/drawing/2016/5/13/chartex" xmlns:cx8="http://schemas.microsoft.com/office/drawing/2016/5/14/chartex" xmlns:mc="http://schemas.openxmlformats.org/markup-compatibility/2006" xmlns:aink="http://schemas.microsoft.com/office/drawing/2016/ink" xmlns:am3d="http://schemas.microsoft.com/office/drawing/2017/model3d" xmlns:o="urn:schemas-microsoft-com:office:office" xmlns:oel="http://schemas.microsoft.com/office/2019/extlst" xmlns:r="http://schemas.openxmlformats.org/officeDocument/2006/relationships" xmlns:m="http://schemas.openxmlformats.org/officeDocument/2006/math" xmlns:v="urn:schemas-microsoft-com:vml" xmlns:wp14="http://schemas.microsoft.com/office/word/2010/wordprocessingDrawing" xmlns:wp="http://schemas.openxmlformats.org/drawingml/2006/wordprocessingDrawing" xmlns:w10="urn:schemas-microsoft-com:office:word" xmlns:w="http://schemas.openxmlformats.org/wordprocessingml/2006/main" xmlns:w14="http://schemas.microsoft.com/office/word/2010/wordml" xmlns:w15="http://schemas.microsoft.com/office/word/2012/wordml" xmlns:w16cei="http://schemas.microsoft.com/office/word/2026/wordml/cei" xmlns:w16cex="http://schemas.microsoft.com/office/word/2018/wordml/cex" xmlns:w16cid="http://schemas.microsoft.com/office/word/2016/wordml/cid" xmlns:w16="http://schemas.microsoft.com/office/word/2018/wordml" xmlns:w16du="http://schemas.microsoft.com/office/word/2023/wordml/word16du" xmlns:w16sdtdh="http://schemas.microsoft.com/office/word/2020/wordml/sdtdatahash" xmlns:w16sdtfl="http://schemas.microsoft.com/office/word/2024/wordml/sdtformatlock" xmlns:w16se="http://schemas.microsoft.com/office/word/2015/wordml/symex" xmlns:wpg="http://schemas.microsoft.com/office/word/2010/wordprocessingGroup" xmlns:wpi="http://schemas.microsoft.com/office/word/2010/wordprocessingInk" xmlns:wne="http://schemas.microsoft.com/office/word/2006/wordml" xmlns:wps="http://schemas.microsoft.com/office/word/2010/wordprocessingShape" mc:Ignorable="w14 w15 w16se w16cid w16 w16cex w16sdtdh w16sdtfl w16du wp14">
   <w:abstractNum w:abstractNumId="0" w15:restartNumberingAfterBreak="0">
     <w:nsid w:val="361919DA"/>
     <w:multiLevelType w:val="hybridMultilevel"/>
@@ -903,7 +2435,7 @@
   <w:docDefaults>
     <w:rPrDefault>
       <w:rPr>
-        <w:rFonts w:asciiTheme="minorHAnsi" w:eastAsiaTheme="minorHAnsi" w:hAnsiTheme="minorHAnsi" w:cstheme="minorBidi"/>
+        <w:rFonts w:ascii="Calibri" w:eastAsiaTheme="minorHAnsi" w:hAnsi="Calibri" w:cs="Calibri"/>
         <w:kern w:val="2"/>
         <w:sz w:val="24"/>
         <w:szCs w:val="24"/>
@@ -1298,9 +2830,6 @@
   <w:style w:type="paragraph" w:default="1" w:styleId="Normal">
     <w:name w:val="Normal"/>
     <w:qFormat/>
-    <w:rPr>
-      <w:lang w:val="en-CA"/>
-    </w:rPr>
   </w:style>
   <w:style w:type="paragraph" w:styleId="Heading1">
     <w:name w:val="heading 1"/>
@@ -1862,6 +3391,25 @@
       <w:color w:val="666666"/>
     </w:rPr>
   </w:style>
+  <w:style w:type="table" w:styleId="TableGrid">
+    <w:name w:val="Table Grid"/>
+    <w:basedOn w:val="TableNormal"/>
+    <w:uiPriority w:val="39"/>
+    <w:rsid w:val="00874C0E"/>
+    <w:pPr>
+      <w:spacing w:after="0" w:line="240" w:lineRule="auto"/>
+    </w:pPr>
+    <w:tblPr>
+      <w:tblBorders>
+        <w:top w:val="single" w:sz="4" w:space="0" w:color="auto"/>
+        <w:left w:val="single" w:sz="4" w:space="0" w:color="auto"/>
+        <w:bottom w:val="single" w:sz="4" w:space="0" w:color="auto"/>
+        <w:right w:val="single" w:sz="4" w:space="0" w:color="auto"/>
+        <w:insideH w:val="single" w:sz="4" w:space="0" w:color="auto"/>
+        <w:insideV w:val="single" w:sz="4" w:space="0" w:color="auto"/>
+      </w:tblBorders>
+    </w:tblPr>
+  </w:style>
 </w:styles>
 </file>
 

</xml_diff>